<commit_message>
Digitalni gramotnost h5: LibreOffice nahrazeno VLC
Priklad open source v listu, planu a reseni je VLC (Karel: ve vyuce
vzdy jen Office 365).

Co-Authored-By: Claude Opus 5.5 <noreply@anthropic.com>
</commit_message>
<xml_diff>
--- a/public/materialy/1L/2/Pracovní listy/5. Software a licence.docx
+++ b/public/materialy/1L/2/Pracovní listy/5. Software a licence.docx
@@ -187,7 +187,7 @@
         <w:t>Open source</w:t>
       </w:r>
       <w:r>
-        <w:t xml:space="preserve"> = zdarma včetně „receptu“ — kódu, který smíš upravovat (GIMP, LibreOffice, Linux).</w:t>
+        <w:t xml:space="preserve"> = zdarma včetně „receptu“ — kódu, který smíš upravovat (GIMP, VLC, Linux).</w:t>
       </w:r>
     </w:p>
     <w:p>
@@ -418,7 +418,7 @@
         <w:spacing w:after="40"/>
       </w:pPr>
       <w:r>
-        <w:t>Zařaď těchto 6 programů: Windows, Word (v rámci Microsoft 365), GIMP, Spotify, Chrome, LibreOffice.</w:t>
+        <w:t>Zařaď těchto 6 programů: Windows, Word (v rámci Microsoft 365), GIMP, Spotify, Chrome, VLC.</w:t>
       </w:r>
     </w:p>
     <w:p>

</xml_diff>